<commit_message>
Add Team 8 member names to the lab 5 submission document
Course, professor and the four team members with IDs now head the first
page, taken from the team table in README.md.

Also replaces the hardcoded page break in answer 3 with cantSplit and
repeating header rows on every table. The break was positioned for the
old pagination and left most of a page empty once the header block
shifted the content down.

Co-Authored-By: Claude Opus 5 (1M context) <noreply@anthropic.com>
</commit_message>
<xml_diff>
--- a/lab5/Lab_5_SVM_Solutions.docx
+++ b/lab5/Lab_5_SVM_Solutions.docx
@@ -44,6 +44,283 @@
           <w:szCs w:val="32"/>
         </w:rPr>
         <w:t xml:space="preserve"> </w:t>
+      </w:r>
+    </w:p>
+    <w:p>
+      <w:pPr>
+        <w:spacing w:before="40" w:after="160"/>
+        <w:ind w:left="0"/>
+      </w:pPr>
+      <w:r>
+        <w:rPr>
+          <w:b w:val="0"/>
+          <w:i/>
+          <w:sz w:val="21"/>
+        </w:rPr>
+        <w:t>CS582 – Machine Learning        Professor: Emdad Khan, PhD</w:t>
+      </w:r>
+    </w:p>
+    <w:p>
+      <w:pPr>
+        <w:spacing w:before="0" w:after="80"/>
+        <w:ind w:left="0"/>
+      </w:pPr>
+      <w:r>
+        <w:rPr>
+          <w:b/>
+          <w:i w:val="0"/>
+          <w:color w:val="1F3B73"/>
+          <w:sz w:val="22"/>
+        </w:rPr>
+        <w:t>Team 8</w:t>
+      </w:r>
+    </w:p>
+    <w:tbl>
+      <w:tblPr>
+        <w:tblW w:type="auto" w:w="0"/>
+        <w:tblLayout w:type="fixed"/>
+        <w:tblLook w:firstColumn="1" w:firstRow="1" w:lastColumn="0" w:lastRow="0" w:noHBand="0" w:noVBand="1" w:val="04A0"/>
+        <w:tblBorders>
+          <w:top w:val="single" w:sz="4" w:color="9AA7BD"/>
+          <w:left w:val="single" w:sz="4" w:color="9AA7BD"/>
+          <w:bottom w:val="single" w:sz="4" w:color="9AA7BD"/>
+          <w:right w:val="single" w:sz="4" w:color="9AA7BD"/>
+          <w:insideH w:val="single" w:sz="4" w:color="9AA7BD"/>
+          <w:insideV w:val="single" w:sz="4" w:color="9AA7BD"/>
+        </w:tblBorders>
+      </w:tblPr>
+      <w:tblGrid>
+        <w:gridCol w:w="4680"/>
+        <w:gridCol w:w="4680"/>
+      </w:tblGrid>
+      <w:tr>
+        <w:trPr>
+          <w:cantSplit/>
+          <w:tblHeader/>
+        </w:trPr>
+        <w:tc>
+          <w:tcPr>
+            <w:tcW w:type="dxa" w:w="1872"/>
+            <w:shd w:val="clear" w:fill="E8EDF5"/>
+          </w:tcPr>
+          <w:p>
+            <w:pPr>
+              <w:keepNext/>
+              <w:spacing w:before="40" w:after="40"/>
+            </w:pPr>
+            <w:r/>
+            <w:r>
+              <w:rPr>
+                <w:b/>
+                <w:sz w:val="20"/>
+              </w:rPr>
+              <w:t>ID</w:t>
+            </w:r>
+          </w:p>
+        </w:tc>
+        <w:tc>
+          <w:tcPr>
+            <w:tcW w:type="dxa" w:w="4608"/>
+            <w:shd w:val="clear" w:fill="E8EDF5"/>
+          </w:tcPr>
+          <w:p>
+            <w:pPr>
+              <w:keepNext/>
+              <w:spacing w:before="40" w:after="40"/>
+            </w:pPr>
+            <w:r/>
+            <w:r>
+              <w:rPr>
+                <w:b/>
+                <w:sz w:val="20"/>
+              </w:rPr>
+              <w:t>Name</w:t>
+            </w:r>
+          </w:p>
+        </w:tc>
+      </w:tr>
+      <w:tr>
+        <w:trPr>
+          <w:cantSplit/>
+        </w:trPr>
+        <w:tc>
+          <w:tcPr>
+            <w:tcW w:type="dxa" w:w="1872"/>
+          </w:tcPr>
+          <w:p>
+            <w:pPr>
+              <w:keepNext/>
+              <w:spacing w:before="40" w:after="40"/>
+            </w:pPr>
+            <w:r/>
+            <w:r>
+              <w:rPr>
+                <w:b w:val="0"/>
+                <w:sz w:val="20"/>
+              </w:rPr>
+              <w:t>618649</w:t>
+            </w:r>
+          </w:p>
+        </w:tc>
+        <w:tc>
+          <w:tcPr>
+            <w:tcW w:type="dxa" w:w="4608"/>
+          </w:tcPr>
+          <w:p>
+            <w:pPr>
+              <w:keepNext/>
+              <w:spacing w:before="40" w:after="40"/>
+            </w:pPr>
+            <w:r/>
+            <w:r>
+              <w:rPr>
+                <w:b w:val="0"/>
+                <w:sz w:val="20"/>
+              </w:rPr>
+              <w:t>Nomin Nergui</w:t>
+            </w:r>
+          </w:p>
+        </w:tc>
+      </w:tr>
+      <w:tr>
+        <w:trPr>
+          <w:cantSplit/>
+        </w:trPr>
+        <w:tc>
+          <w:tcPr>
+            <w:tcW w:type="dxa" w:w="1872"/>
+          </w:tcPr>
+          <w:p>
+            <w:pPr>
+              <w:keepNext/>
+              <w:spacing w:before="40" w:after="40"/>
+            </w:pPr>
+            <w:r/>
+            <w:r>
+              <w:rPr>
+                <w:b w:val="0"/>
+                <w:sz w:val="20"/>
+              </w:rPr>
+              <w:t>618048</w:t>
+            </w:r>
+          </w:p>
+        </w:tc>
+        <w:tc>
+          <w:tcPr>
+            <w:tcW w:type="dxa" w:w="4608"/>
+          </w:tcPr>
+          <w:p>
+            <w:pPr>
+              <w:keepNext/>
+              <w:spacing w:before="40" w:after="40"/>
+            </w:pPr>
+            <w:r/>
+            <w:r>
+              <w:rPr>
+                <w:b w:val="0"/>
+                <w:sz w:val="20"/>
+              </w:rPr>
+              <w:t>Tumenjargal Altanginj</w:t>
+            </w:r>
+          </w:p>
+        </w:tc>
+      </w:tr>
+      <w:tr>
+        <w:trPr>
+          <w:cantSplit/>
+        </w:trPr>
+        <w:tc>
+          <w:tcPr>
+            <w:tcW w:type="dxa" w:w="1872"/>
+          </w:tcPr>
+          <w:p>
+            <w:pPr>
+              <w:keepNext/>
+              <w:spacing w:before="40" w:after="40"/>
+            </w:pPr>
+            <w:r/>
+            <w:r>
+              <w:rPr>
+                <w:b w:val="0"/>
+                <w:sz w:val="20"/>
+              </w:rPr>
+              <w:t>619957</w:t>
+            </w:r>
+          </w:p>
+        </w:tc>
+        <w:tc>
+          <w:tcPr>
+            <w:tcW w:type="dxa" w:w="4608"/>
+          </w:tcPr>
+          <w:p>
+            <w:pPr>
+              <w:keepNext/>
+              <w:spacing w:before="40" w:after="40"/>
+            </w:pPr>
+            <w:r/>
+            <w:r>
+              <w:rPr>
+                <w:b w:val="0"/>
+                <w:sz w:val="20"/>
+              </w:rPr>
+              <w:t>Temuujin Bat Amgalan</w:t>
+            </w:r>
+          </w:p>
+        </w:tc>
+      </w:tr>
+      <w:tr>
+        <w:trPr>
+          <w:cantSplit/>
+        </w:trPr>
+        <w:tc>
+          <w:tcPr>
+            <w:tcW w:type="dxa" w:w="1872"/>
+          </w:tcPr>
+          <w:p>
+            <w:pPr>
+              <w:spacing w:before="40" w:after="40"/>
+            </w:pPr>
+            <w:r/>
+            <w:r>
+              <w:rPr>
+                <w:b w:val="0"/>
+                <w:sz w:val="20"/>
+              </w:rPr>
+              <w:t>618643</w:t>
+            </w:r>
+          </w:p>
+        </w:tc>
+        <w:tc>
+          <w:tcPr>
+            <w:tcW w:type="dxa" w:w="4608"/>
+          </w:tcPr>
+          <w:p>
+            <w:pPr>
+              <w:spacing w:before="40" w:after="40"/>
+            </w:pPr>
+            <w:r/>
+            <w:r>
+              <w:rPr>
+                <w:b w:val="0"/>
+                <w:sz w:val="20"/>
+              </w:rPr>
+              <w:t>Temuulen Khuchit</w:t>
+            </w:r>
+          </w:p>
+        </w:tc>
+      </w:tr>
+    </w:tbl>
+    <w:p>
+      <w:pPr>
+        <w:spacing w:before="0" w:after="40"/>
+        <w:ind w:left="0"/>
+      </w:pPr>
+      <w:r>
+        <w:rPr>
+          <w:b w:val="0"/>
+          <w:i w:val="0"/>
+          <w:sz w:val="22"/>
+        </w:rPr>
       </w:r>
     </w:p>
     <w:p>
@@ -484,6 +761,10 @@
         <w:gridCol w:w="3120"/>
       </w:tblGrid>
       <w:tr>
+        <w:trPr>
+          <w:cantSplit/>
+          <w:tblHeader/>
+        </w:trPr>
         <w:tc>
           <w:tcPr>
             <w:tcW w:type="dxa" w:w="3168"/>
@@ -546,6 +827,9 @@
         </w:tc>
       </w:tr>
       <w:tr>
+        <w:trPr>
+          <w:cantSplit/>
+        </w:trPr>
         <w:tc>
           <w:tcPr>
             <w:tcW w:type="dxa" w:w="3168"/>
@@ -605,6 +889,9 @@
         </w:tc>
       </w:tr>
       <w:tr>
+        <w:trPr>
+          <w:cantSplit/>
+        </w:trPr>
         <w:tc>
           <w:tcPr>
             <w:tcW w:type="dxa" w:w="3168"/>
@@ -664,6 +951,9 @@
         </w:tc>
       </w:tr>
       <w:tr>
+        <w:trPr>
+          <w:cantSplit/>
+        </w:trPr>
         <w:tc>
           <w:tcPr>
             <w:tcW w:type="dxa" w:w="3168"/>
@@ -1034,6 +1324,10 @@
         <w:gridCol w:w="2340"/>
       </w:tblGrid>
       <w:tr>
+        <w:trPr>
+          <w:cantSplit/>
+          <w:tblHeader/>
+        </w:trPr>
         <w:tc>
           <w:tcPr>
             <w:tcW w:type="dxa" w:w="1008"/>
@@ -1116,6 +1410,9 @@
         </w:tc>
       </w:tr>
       <w:tr>
+        <w:trPr>
+          <w:cantSplit/>
+        </w:trPr>
         <w:tc>
           <w:tcPr>
             <w:tcW w:type="dxa" w:w="1008"/>
@@ -1194,6 +1491,9 @@
         </w:tc>
       </w:tr>
       <w:tr>
+        <w:trPr>
+          <w:cantSplit/>
+        </w:trPr>
         <w:tc>
           <w:tcPr>
             <w:tcW w:type="dxa" w:w="1008"/>
@@ -1272,6 +1572,9 @@
         </w:tc>
       </w:tr>
       <w:tr>
+        <w:trPr>
+          <w:cantSplit/>
+        </w:trPr>
         <w:tc>
           <w:tcPr>
             <w:tcW w:type="dxa" w:w="1008"/>
@@ -1350,6 +1653,9 @@
         </w:tc>
       </w:tr>
       <w:tr>
+        <w:trPr>
+          <w:cantSplit/>
+        </w:trPr>
         <w:tc>
           <w:tcPr>
             <w:tcW w:type="dxa" w:w="1008"/>
@@ -1428,6 +1734,9 @@
         </w:tc>
       </w:tr>
       <w:tr>
+        <w:trPr>
+          <w:cantSplit/>
+        </w:trPr>
         <w:tc>
           <w:tcPr>
             <w:tcW w:type="dxa" w:w="1008"/>
@@ -1506,6 +1815,9 @@
         </w:tc>
       </w:tr>
       <w:tr>
+        <w:trPr>
+          <w:cantSplit/>
+        </w:trPr>
         <w:tc>
           <w:tcPr>
             <w:tcW w:type="dxa" w:w="1008"/>
@@ -2271,14 +2583,6 @@
     </w:p>
     <w:p>
       <w:pPr>
-        <w:spacing w:after="0"/>
-      </w:pPr>
-      <w:r>
-        <w:br w:type="page"/>
-      </w:r>
-    </w:p>
-    <w:p>
-      <w:pPr>
         <w:spacing w:before="160" w:after="80"/>
         <w:ind w:left="0"/>
       </w:pPr>
@@ -2311,6 +2615,10 @@
         <w:gridCol w:w="3120"/>
       </w:tblGrid>
       <w:tr>
+        <w:trPr>
+          <w:cantSplit/>
+          <w:tblHeader/>
+        </w:trPr>
         <w:tc>
           <w:tcPr>
             <w:tcW w:type="dxa" w:w="3456"/>
@@ -2373,6 +2681,9 @@
         </w:tc>
       </w:tr>
       <w:tr>
+        <w:trPr>
+          <w:cantSplit/>
+        </w:trPr>
         <w:tc>
           <w:tcPr>
             <w:tcW w:type="dxa" w:w="3456"/>
@@ -2432,6 +2743,9 @@
         </w:tc>
       </w:tr>
       <w:tr>
+        <w:trPr>
+          <w:cantSplit/>
+        </w:trPr>
         <w:tc>
           <w:tcPr>
             <w:tcW w:type="dxa" w:w="3456"/>
@@ -2491,6 +2805,9 @@
         </w:tc>
       </w:tr>
       <w:tr>
+        <w:trPr>
+          <w:cantSplit/>
+        </w:trPr>
         <w:tc>
           <w:tcPr>
             <w:tcW w:type="dxa" w:w="3456"/>
@@ -2550,6 +2867,9 @@
         </w:tc>
       </w:tr>
       <w:tr>
+        <w:trPr>
+          <w:cantSplit/>
+        </w:trPr>
         <w:tc>
           <w:tcPr>
             <w:tcW w:type="dxa" w:w="3456"/>
@@ -2638,6 +2958,10 @@
         <w:gridCol w:w="4680"/>
       </w:tblGrid>
       <w:tr>
+        <w:trPr>
+          <w:cantSplit/>
+          <w:tblHeader/>
+        </w:trPr>
         <w:tc>
           <w:tcPr>
             <w:tcW w:type="dxa" w:w="4680"/>
@@ -2680,6 +3004,9 @@
         </w:tc>
       </w:tr>
       <w:tr>
+        <w:trPr>
+          <w:cantSplit/>
+        </w:trPr>
         <w:tc>
           <w:tcPr>
             <w:tcW w:type="dxa" w:w="4680"/>
@@ -2720,6 +3047,9 @@
         </w:tc>
       </w:tr>
       <w:tr>
+        <w:trPr>
+          <w:cantSplit/>
+        </w:trPr>
         <w:tc>
           <w:tcPr>
             <w:tcW w:type="dxa" w:w="4680"/>
@@ -2760,6 +3090,9 @@
         </w:tc>
       </w:tr>
       <w:tr>
+        <w:trPr>
+          <w:cantSplit/>
+        </w:trPr>
         <w:tc>
           <w:tcPr>
             <w:tcW w:type="dxa" w:w="4680"/>
@@ -2800,6 +3133,9 @@
         </w:tc>
       </w:tr>
       <w:tr>
+        <w:trPr>
+          <w:cantSplit/>
+        </w:trPr>
         <w:tc>
           <w:tcPr>
             <w:tcW w:type="dxa" w:w="4680"/>
@@ -3548,6 +3884,10 @@
         <w:gridCol w:w="4680"/>
       </w:tblGrid>
       <w:tr>
+        <w:trPr>
+          <w:cantSplit/>
+          <w:tblHeader/>
+        </w:trPr>
         <w:tc>
           <w:tcPr>
             <w:tcW w:type="dxa" w:w="3312"/>
@@ -3590,6 +3930,9 @@
         </w:tc>
       </w:tr>
       <w:tr>
+        <w:trPr>
+          <w:cantSplit/>
+        </w:trPr>
         <w:tc>
           <w:tcPr>
             <w:tcW w:type="dxa" w:w="3312"/>
@@ -3630,6 +3973,9 @@
         </w:tc>
       </w:tr>
       <w:tr>
+        <w:trPr>
+          <w:cantSplit/>
+        </w:trPr>
         <w:tc>
           <w:tcPr>
             <w:tcW w:type="dxa" w:w="3312"/>
@@ -3670,6 +4016,9 @@
         </w:tc>
       </w:tr>
       <w:tr>
+        <w:trPr>
+          <w:cantSplit/>
+        </w:trPr>
         <w:tc>
           <w:tcPr>
             <w:tcW w:type="dxa" w:w="3312"/>

</xml_diff>